<commit_message>
Update paper5 federated CTI submission materials
Refresh final_submission bundle, LaTeX source, references, and rendered
PDF/DOCX outputs.

Co-Authored-By: Claude Sonnet 5 <noreply@anthropic.com>
</commit_message>
<xml_diff>
--- a/paper5-federated-intel/final_submission/ICOIICS_245_paper.docx
+++ b/paper5-federated-intel/final_submission/ICOIICS_245_paper.docx
@@ -144,6 +144,16 @@
     </w:p>
     <w:p>
       <w:pPr>
+        <w:sectPr>
+          <w:pgSz w:w="12240" w:h="15840"/>
+          <w:pgMar w:top="1080" w:right="1037" w:bottom="1080" w:left="1037" w:header="720" w:footer="720" w:gutter="0"/>
+          <w:cols w:space="720"/>
+          <w:docGrid w:linePitch="360"/>
+        </w:sectPr>
+      </w:pPr>
+    </w:p>
+    <w:p>
+      <w:pPr>
         <w:spacing w:after="40"/>
         <w:jc w:val="both"/>
       </w:pPr>
@@ -207,15 +217,15 @@
     <w:p>
       <w:pPr>
         <w:spacing w:after="40" w:before="120"/>
-        <w:jc w:val="left"/>
+        <w:jc w:val="center"/>
       </w:pPr>
       <w:r>
         <w:rPr>
           <w:b/>
           <w:i w:val="0"/>
-          <w:sz w:val="22"/>
-        </w:rPr>
-        <w:t>Introduction</w:t>
+          <w:sz w:val="20"/>
+        </w:rPr>
+        <w:t>I. INTRODUCTION</w:t>
       </w:r>
     </w:p>
     <w:p>
@@ -337,15 +347,15 @@
     <w:p>
       <w:pPr>
         <w:spacing w:after="40" w:before="120"/>
-        <w:jc w:val="left"/>
+        <w:jc w:val="center"/>
       </w:pPr>
       <w:r>
         <w:rPr>
           <w:b/>
           <w:i w:val="0"/>
-          <w:sz w:val="22"/>
-        </w:rPr>
-        <w:t>Related Work</w:t>
+          <w:sz w:val="20"/>
+        </w:rPr>
+        <w:t>II. RELATED WORK</w:t>
       </w:r>
     </w:p>
     <w:p>
@@ -359,7 +369,7 @@
           <w:i/>
           <w:sz w:val="20"/>
         </w:rPr>
-        <w:t>Centralized and federated CTI platforms</w:t>
+        <w:t>A. Centralized and federated CTI platforms</w:t>
       </w:r>
     </w:p>
     <w:p>
@@ -388,7 +398,7 @@
           <w:i/>
           <w:sz w:val="20"/>
         </w:rPr>
-        <w:t>Blockchain-based CTI sharing</w:t>
+        <w:t>B. Blockchain-based CTI sharing</w:t>
       </w:r>
     </w:p>
     <w:p>
@@ -403,7 +413,7 @@
           <w:i w:val="0"/>
           <w:sz w:val="20"/>
         </w:rPr>
-        <w:t>Ruggiero and Bonomi[4] review requirements and residual threats for ledger-based CTI exchange. TRADE[5] is a peer-to-peer exchange in which the producer controls dissemination; TrustShare[6] combines on-chain records with access-control machinery; Dunnett et al. survey the challenges[9] and propose a verifiable, differential sharing framework[7]; BFLS[10] shares detection models rather than indicators through federated learning; Tariq et al.[11] survey the wider space. These systems place policy, reputation, or coordination logic on-chain. The present work is deliberately minimal (tagged hashes only) so that the properties of the substrate can be measured without confounding them with contract behavior. Table I summarizes the positioning.</w:t>
+        <w:t>Ruggiero and Bonomi[4] review requirements and residual threats for ledger-based CTI exchange. TRADE[5] is a peer-to-peer exchange in which the producer controls dissemination; TrustShare[6] combines on-chain records with access-control machinery; Dunnett et al. survey the challenges[11] and propose a verifiable, differential sharing framework[7]; BFLS[9] shares detection models rather than indicators through federated learning; Tariq et al.[12] survey the wider space. These systems place policy, reputation, or coordination logic on-chain. The present work is deliberately minimal (tagged hashes only) so that the properties of the substrate can be measured without confounding them with contract behavior. Table I summarizes the positioning.</w:t>
       </w:r>
     </w:p>
     <w:p>
@@ -417,7 +427,7 @@
           <w:i/>
           <w:sz w:val="20"/>
         </w:rPr>
-        <w:t>Byzantine agreement and honeypot sensing</w:t>
+        <w:t>C. Byzantine agreement and honeypot sensing</w:t>
       </w:r>
     </w:p>
     <w:p>
@@ -432,8 +442,19 @@
           <w:i w:val="0"/>
           <w:sz w:val="20"/>
         </w:rPr>
-        <w:t>Agreement among mutually distrusting writers is the Byzantine generals problem[12]; the base chain's consensus solves it and the scheme inherits that guarantee rather than re-implementing it. Honeypots have long been used as sensors, on the premise that any traffic they receive is unsolicited[13, 14]; Vetterl and Clayton showed that low- and medium-interaction decoys are fingerprintable at Internet scale[15], which is one reason to correlate many sensors rather than rely on one. Otoum et al.[16] coordinate adaptive IoT honeypots through a trust-aware ledger in which nodes read and write contract state; here nodes exchange nothing and consult no trust score.</w:t>
-      </w:r>
+        <w:t>Agreement among mutually distrusting writers is the Byzantine generals problem[13]; the base chain's consensus solves it and the scheme inherits that guarantee rather than re-implementing it. Honeypots have long been used as sensors, on the premise that any traffic they receive is unsolicited[14, 15]; Vetterl and Clayton showed that low- and medium-interaction decoys are fingerprintable at Internet scale[16], which is one reason to correlate many sensors rather than rely on one. Otoum et al.[10] coordinate adaptive IoT honeypots through a trust-aware ledger in which nodes read and write contract state; here nodes exchange nothing and consult no trust score.</w:t>
+      </w:r>
+    </w:p>
+    <w:p>
+      <w:pPr>
+        <w:sectPr>
+          <w:type w:val="continuous"/>
+          <w:pgSz w:w="12240" w:h="15840"/>
+          <w:pgMar w:top="1080" w:right="1037" w:bottom="1080" w:left="1037" w:header="720" w:footer="720" w:gutter="0"/>
+          <w:cols w:space="360" w:num="2"/>
+          <w:docGrid w:linePitch="360"/>
+        </w:sectPr>
+      </w:pPr>
     </w:p>
     <w:p>
       <w:pPr>
@@ -467,7 +488,7 @@
         <w:trPr/>
         <w:tc>
           <w:tcPr>
-            <w:tcW w:type="dxa" w:w="1089"/>
+            <w:tcW w:type="dxa" w:w="2138"/>
           </w:tcPr>
           <w:p>
             <w:pPr>
@@ -484,7 +505,7 @@
         </w:tc>
         <w:tc>
           <w:tcPr>
-            <w:tcW w:type="dxa" w:w="891"/>
+            <w:tcW w:type="dxa" w:w="1862"/>
           </w:tcPr>
           <w:p>
             <w:pPr>
@@ -501,7 +522,7 @@
         </w:tc>
         <w:tc>
           <w:tcPr>
-            <w:tcW w:type="dxa" w:w="1089"/>
+            <w:tcW w:type="dxa" w:w="2276"/>
           </w:tcPr>
           <w:p>
             <w:pPr>
@@ -518,7 +539,7 @@
         </w:tc>
         <w:tc>
           <w:tcPr>
-            <w:tcW w:type="dxa" w:w="594"/>
+            <w:tcW w:type="dxa" w:w="1241"/>
           </w:tcPr>
           <w:p>
             <w:pPr>
@@ -535,7 +556,7 @@
         </w:tc>
         <w:tc>
           <w:tcPr>
-            <w:tcW w:type="dxa" w:w="1089"/>
+            <w:tcW w:type="dxa" w:w="2276"/>
           </w:tcPr>
           <w:p>
             <w:pPr>
@@ -555,7 +576,7 @@
         <w:trPr/>
         <w:tc>
           <w:tcPr>
-            <w:tcW w:type="dxa" w:w="1089"/>
+            <w:tcW w:type="dxa" w:w="2138"/>
           </w:tcPr>
           <w:p>
             <w:pPr>
@@ -571,7 +592,7 @@
         </w:tc>
         <w:tc>
           <w:tcPr>
-            <w:tcW w:type="dxa" w:w="891"/>
+            <w:tcW w:type="dxa" w:w="1862"/>
           </w:tcPr>
           <w:p>
             <w:pPr>
@@ -587,7 +608,7 @@
         </w:tc>
         <w:tc>
           <w:tcPr>
-            <w:tcW w:type="dxa" w:w="1089"/>
+            <w:tcW w:type="dxa" w:w="2276"/>
           </w:tcPr>
           <w:p>
             <w:pPr>
@@ -603,7 +624,7 @@
         </w:tc>
         <w:tc>
           <w:tcPr>
-            <w:tcW w:type="dxa" w:w="594"/>
+            <w:tcW w:type="dxa" w:w="1241"/>
           </w:tcPr>
           <w:p>
             <w:pPr>
@@ -619,7 +640,7 @@
         </w:tc>
         <w:tc>
           <w:tcPr>
-            <w:tcW w:type="dxa" w:w="1089"/>
+            <w:tcW w:type="dxa" w:w="2276"/>
           </w:tcPr>
           <w:p>
             <w:pPr>
@@ -638,7 +659,7 @@
         <w:trPr/>
         <w:tc>
           <w:tcPr>
-            <w:tcW w:type="dxa" w:w="1089"/>
+            <w:tcW w:type="dxa" w:w="2138"/>
           </w:tcPr>
           <w:p>
             <w:pPr>
@@ -654,7 +675,7 @@
         </w:tc>
         <w:tc>
           <w:tcPr>
-            <w:tcW w:type="dxa" w:w="891"/>
+            <w:tcW w:type="dxa" w:w="1862"/>
           </w:tcPr>
           <w:p>
             <w:pPr>
@@ -670,7 +691,7 @@
         </w:tc>
         <w:tc>
           <w:tcPr>
-            <w:tcW w:type="dxa" w:w="1089"/>
+            <w:tcW w:type="dxa" w:w="2276"/>
           </w:tcPr>
           <w:p>
             <w:pPr>
@@ -686,7 +707,7 @@
         </w:tc>
         <w:tc>
           <w:tcPr>
-            <w:tcW w:type="dxa" w:w="594"/>
+            <w:tcW w:type="dxa" w:w="1241"/>
           </w:tcPr>
           <w:p>
             <w:pPr>
@@ -702,7 +723,7 @@
         </w:tc>
         <w:tc>
           <w:tcPr>
-            <w:tcW w:type="dxa" w:w="1089"/>
+            <w:tcW w:type="dxa" w:w="2276"/>
           </w:tcPr>
           <w:p>
             <w:pPr>
@@ -721,7 +742,7 @@
         <w:trPr/>
         <w:tc>
           <w:tcPr>
-            <w:tcW w:type="dxa" w:w="1089"/>
+            <w:tcW w:type="dxa" w:w="2138"/>
           </w:tcPr>
           <w:p>
             <w:pPr>
@@ -737,7 +758,7 @@
         </w:tc>
         <w:tc>
           <w:tcPr>
-            <w:tcW w:type="dxa" w:w="891"/>
+            <w:tcW w:type="dxa" w:w="1862"/>
           </w:tcPr>
           <w:p>
             <w:pPr>
@@ -753,7 +774,7 @@
         </w:tc>
         <w:tc>
           <w:tcPr>
-            <w:tcW w:type="dxa" w:w="1089"/>
+            <w:tcW w:type="dxa" w:w="2276"/>
           </w:tcPr>
           <w:p>
             <w:pPr>
@@ -769,7 +790,7 @@
         </w:tc>
         <w:tc>
           <w:tcPr>
-            <w:tcW w:type="dxa" w:w="594"/>
+            <w:tcW w:type="dxa" w:w="1241"/>
           </w:tcPr>
           <w:p>
             <w:pPr>
@@ -785,7 +806,7 @@
         </w:tc>
         <w:tc>
           <w:tcPr>
-            <w:tcW w:type="dxa" w:w="1089"/>
+            <w:tcW w:type="dxa" w:w="2276"/>
           </w:tcPr>
           <w:p>
             <w:pPr>
@@ -804,7 +825,7 @@
         <w:trPr/>
         <w:tc>
           <w:tcPr>
-            <w:tcW w:type="dxa" w:w="1089"/>
+            <w:tcW w:type="dxa" w:w="2138"/>
           </w:tcPr>
           <w:p>
             <w:pPr>
@@ -814,13 +835,13 @@
               <w:rPr>
                 <w:sz w:val="14"/>
               </w:rPr>
-              <w:t>Dunnett et al.[7], BFLS[10]</w:t>
+              <w:t>Dunnett et al.[7], BFLS[9]</w:t>
             </w:r>
           </w:p>
         </w:tc>
         <w:tc>
           <w:tcPr>
-            <w:tcW w:type="dxa" w:w="891"/>
+            <w:tcW w:type="dxa" w:w="1862"/>
           </w:tcPr>
           <w:p>
             <w:pPr>
@@ -836,7 +857,7 @@
         </w:tc>
         <w:tc>
           <w:tcPr>
-            <w:tcW w:type="dxa" w:w="1089"/>
+            <w:tcW w:type="dxa" w:w="2276"/>
           </w:tcPr>
           <w:p>
             <w:pPr>
@@ -852,7 +873,7 @@
         </w:tc>
         <w:tc>
           <w:tcPr>
-            <w:tcW w:type="dxa" w:w="594"/>
+            <w:tcW w:type="dxa" w:w="1241"/>
           </w:tcPr>
           <w:p>
             <w:pPr>
@@ -868,7 +889,7 @@
         </w:tc>
         <w:tc>
           <w:tcPr>
-            <w:tcW w:type="dxa" w:w="1089"/>
+            <w:tcW w:type="dxa" w:w="2276"/>
           </w:tcPr>
           <w:p>
             <w:pPr>
@@ -887,7 +908,7 @@
         <w:trPr/>
         <w:tc>
           <w:tcPr>
-            <w:tcW w:type="dxa" w:w="1089"/>
+            <w:tcW w:type="dxa" w:w="2138"/>
           </w:tcPr>
           <w:p>
             <w:pPr>
@@ -897,13 +918,13 @@
               <w:rPr>
                 <w:sz w:val="14"/>
               </w:rPr>
-              <w:t>Otoum et al.[16]</w:t>
+              <w:t>Otoum et al.[10]</w:t>
             </w:r>
           </w:p>
         </w:tc>
         <w:tc>
           <w:tcPr>
-            <w:tcW w:type="dxa" w:w="891"/>
+            <w:tcW w:type="dxa" w:w="1862"/>
           </w:tcPr>
           <w:p>
             <w:pPr>
@@ -919,7 +940,7 @@
         </w:tc>
         <w:tc>
           <w:tcPr>
-            <w:tcW w:type="dxa" w:w="1089"/>
+            <w:tcW w:type="dxa" w:w="2276"/>
           </w:tcPr>
           <w:p>
             <w:pPr>
@@ -935,7 +956,7 @@
         </w:tc>
         <w:tc>
           <w:tcPr>
-            <w:tcW w:type="dxa" w:w="594"/>
+            <w:tcW w:type="dxa" w:w="1241"/>
           </w:tcPr>
           <w:p>
             <w:pPr>
@@ -951,7 +972,7 @@
         </w:tc>
         <w:tc>
           <w:tcPr>
-            <w:tcW w:type="dxa" w:w="1089"/>
+            <w:tcW w:type="dxa" w:w="2276"/>
           </w:tcPr>
           <w:p>
             <w:pPr>
@@ -970,7 +991,7 @@
         <w:trPr/>
         <w:tc>
           <w:tcPr>
-            <w:tcW w:type="dxa" w:w="1089"/>
+            <w:tcW w:type="dxa" w:w="2138"/>
           </w:tcPr>
           <w:p>
             <w:pPr>
@@ -986,7 +1007,7 @@
         </w:tc>
         <w:tc>
           <w:tcPr>
-            <w:tcW w:type="dxa" w:w="891"/>
+            <w:tcW w:type="dxa" w:w="1862"/>
           </w:tcPr>
           <w:p>
             <w:pPr>
@@ -1002,7 +1023,7 @@
         </w:tc>
         <w:tc>
           <w:tcPr>
-            <w:tcW w:type="dxa" w:w="1089"/>
+            <w:tcW w:type="dxa" w:w="2276"/>
           </w:tcPr>
           <w:p>
             <w:pPr>
@@ -1018,7 +1039,7 @@
         </w:tc>
         <w:tc>
           <w:tcPr>
-            <w:tcW w:type="dxa" w:w="594"/>
+            <w:tcW w:type="dxa" w:w="1241"/>
           </w:tcPr>
           <w:p>
             <w:pPr>
@@ -1034,7 +1055,7 @@
         </w:tc>
         <w:tc>
           <w:tcPr>
-            <w:tcW w:type="dxa" w:w="1089"/>
+            <w:tcW w:type="dxa" w:w="2276"/>
           </w:tcPr>
           <w:p>
             <w:pPr>
@@ -1053,16 +1074,27 @@
     <w:p/>
     <w:p>
       <w:pPr>
+        <w:sectPr>
+          <w:type w:val="continuous"/>
+          <w:pgSz w:w="12240" w:h="15840"/>
+          <w:pgMar w:top="1080" w:right="1037" w:bottom="1080" w:left="1037" w:header="720" w:footer="720" w:gutter="0"/>
+          <w:cols w:space="360" w:num="1"/>
+          <w:docGrid w:linePitch="360"/>
+        </w:sectPr>
+      </w:pPr>
+    </w:p>
+    <w:p>
+      <w:pPr>
         <w:spacing w:after="40" w:before="120"/>
-        <w:jc w:val="left"/>
+        <w:jc w:val="center"/>
       </w:pPr>
       <w:r>
         <w:rPr>
           <w:b/>
           <w:i w:val="0"/>
-          <w:sz w:val="22"/>
-        </w:rPr>
-        <w:t>System Model and Problem Statement</w:t>
+          <w:sz w:val="20"/>
+        </w:rPr>
+        <w:t>III. SYSTEM MODEL AND PROBLEM STATEMENT</w:t>
       </w:r>
     </w:p>
     <w:p>
@@ -1090,7 +1122,7 @@
           <w:i/>
           <w:sz w:val="20"/>
         </w:rPr>
-        <w:t>Entities and notation</w:t>
+        <w:t>A. Entities and notation</w:t>
       </w:r>
     </w:p>
     <w:p>
@@ -1219,7 +1251,7 @@
           <w:i/>
           <w:sz w:val="20"/>
         </w:rPr>
-        <w:t>Anchoring and the observer map</w:t>
+        <w:t>B. Anchoring and the observer map</w:t>
       </w:r>
     </w:p>
     <w:p>
@@ -1408,7 +1440,7 @@
           <w:i/>
           <w:sz w:val="20"/>
         </w:rPr>
-        <w:t>Tamper detection for a local log</w:t>
+        <w:t>C. Tamper detection for a local log</w:t>
       </w:r>
     </w:p>
     <w:p>
@@ -1534,7 +1566,7 @@
           <w:i/>
           <w:sz w:val="20"/>
         </w:rPr>
-        <w:t>Threat model</w:t>
+        <w:t>D. Threat model</w:t>
       </w:r>
     </w:p>
     <w:p>
@@ -1688,7 +1720,7 @@
           <w:i/>
           <w:sz w:val="20"/>
         </w:rPr>
-        <w:t>Cost models</w:t>
+        <w:t>E. Cost models</w:t>
       </w:r>
     </w:p>
     <w:p>
@@ -1901,15 +1933,15 @@
     <w:p>
       <w:pPr>
         <w:spacing w:after="40" w:before="120"/>
-        <w:jc w:val="left"/>
+        <w:jc w:val="center"/>
       </w:pPr>
       <w:r>
         <w:rPr>
           <w:b/>
           <w:i w:val="0"/>
-          <w:sz w:val="22"/>
-        </w:rPr>
-        <w:t>Design</w:t>
+          <w:sz w:val="20"/>
+        </w:rPr>
+        <w:t>IV. DESIGN</w:t>
       </w:r>
     </w:p>
     <w:p>
@@ -1925,6 +1957,17 @@
           <w:sz w:val="20"/>
         </w:rPr>
       </w:r>
+    </w:p>
+    <w:p>
+      <w:pPr>
+        <w:sectPr>
+          <w:type w:val="continuous"/>
+          <w:pgSz w:w="12240" w:h="15840"/>
+          <w:pgMar w:top="1080" w:right="1037" w:bottom="1080" w:left="1037" w:header="720" w:footer="720" w:gutter="0"/>
+          <w:cols w:space="360" w:num="2"/>
+          <w:docGrid w:linePitch="360"/>
+        </w:sectPr>
+      </w:pPr>
     </w:p>
     <w:p>
       <w:pPr>
@@ -1981,6 +2024,17 @@
     </w:p>
     <w:p>
       <w:pPr>
+        <w:sectPr>
+          <w:type w:val="continuous"/>
+          <w:pgSz w:w="12240" w:h="15840"/>
+          <w:pgMar w:top="1080" w:right="1037" w:bottom="1080" w:left="1037" w:header="720" w:footer="720" w:gutter="0"/>
+          <w:cols w:space="360" w:num="1"/>
+          <w:docGrid w:linePitch="360"/>
+        </w:sectPr>
+      </w:pPr>
+    </w:p>
+    <w:p>
+      <w:pPr>
         <w:spacing w:after="40" w:before="80"/>
         <w:jc w:val="left"/>
       </w:pPr>
@@ -1990,7 +2044,7 @@
           <w:i/>
           <w:sz w:val="20"/>
         </w:rPr>
-        <w:t>Anchoring and reconstruction</w:t>
+        <w:t>A. Anchoring and reconstruction</w:t>
       </w:r>
     </w:p>
     <w:p>
@@ -2293,7 +2347,7 @@
           <w:i/>
           <w:sz w:val="20"/>
         </w:rPr>
-        <w:t>Keying functions</w:t>
+        <w:t>B. Keying functions</w:t>
       </w:r>
     </w:p>
     <w:p>
@@ -2478,7 +2532,7 @@
           <w:i/>
           <w:sz w:val="20"/>
         </w:rPr>
-        <w:t>Commit–reveal against the echo adversary</w:t>
+        <w:t>C. Commit–reveal against the echo adversary</w:t>
       </w:r>
     </w:p>
     <w:p>
@@ -2955,15 +3009,15 @@
     <w:p>
       <w:pPr>
         <w:spacing w:after="40" w:before="120"/>
-        <w:jc w:val="left"/>
+        <w:jc w:val="center"/>
       </w:pPr>
       <w:r>
         <w:rPr>
           <w:b/>
           <w:i w:val="0"/>
-          <w:sz w:val="22"/>
-        </w:rPr>
-        <w:t>Experimental Setup</w:t>
+          <w:sz w:val="20"/>
+        </w:rPr>
+        <w:t>V. EXPERIMENTAL SETUP</w:t>
       </w:r>
     </w:p>
     <w:p>
@@ -2991,7 +3045,7 @@
           <w:i/>
           <w:sz w:val="20"/>
         </w:rPr>
-        <w:t>Testbed</w:t>
+        <w:t>A. Testbed</w:t>
       </w:r>
     </w:p>
     <w:p>
@@ -3042,6 +3096,17 @@
         </w:rPr>
         <w:t>.py) produces every number in this paper in a single run of 183 s that mined 13,810 blocks; Table II lists the parameters. The harness, the raw results file and the build scripts are available from the authors.</w:t>
       </w:r>
+    </w:p>
+    <w:p>
+      <w:pPr>
+        <w:sectPr>
+          <w:type w:val="continuous"/>
+          <w:pgSz w:w="12240" w:h="15840"/>
+          <w:pgMar w:top="1080" w:right="1037" w:bottom="1080" w:left="1037" w:header="720" w:footer="720" w:gutter="0"/>
+          <w:cols w:space="360" w:num="2"/>
+          <w:docGrid w:linePitch="360"/>
+        </w:sectPr>
+      </w:pPr>
     </w:p>
     <w:p>
       <w:pPr>
@@ -3072,7 +3137,7 @@
         <w:trPr/>
         <w:tc>
           <w:tcPr>
-            <w:tcW w:type="dxa" w:w="445"/>
+            <w:tcW w:type="dxa" w:w="918"/>
           </w:tcPr>
           <w:p>
             <w:pPr>
@@ -3089,7 +3154,7 @@
         </w:tc>
         <w:tc>
           <w:tcPr>
-            <w:tcW w:type="dxa" w:w="4306"/>
+            <w:tcW w:type="dxa" w:w="8874"/>
           </w:tcPr>
           <w:p>
             <w:pPr>
@@ -3109,7 +3174,7 @@
         <w:trPr/>
         <w:tc>
           <w:tcPr>
-            <w:tcW w:type="dxa" w:w="445"/>
+            <w:tcW w:type="dxa" w:w="918"/>
           </w:tcPr>
           <w:p>
             <w:pPr>
@@ -3125,7 +3190,7 @@
         </w:tc>
         <w:tc>
           <w:tcPr>
-            <w:tcW w:type="dxa" w:w="4306"/>
+            <w:tcW w:type="dxa" w:w="8874"/>
           </w:tcPr>
           <w:p>
             <w:pPr>
@@ -3144,7 +3209,7 @@
         <w:trPr/>
         <w:tc>
           <w:tcPr>
-            <w:tcW w:type="dxa" w:w="445"/>
+            <w:tcW w:type="dxa" w:w="918"/>
           </w:tcPr>
           <w:p>
             <w:pPr>
@@ -3160,7 +3225,7 @@
         </w:tc>
         <w:tc>
           <w:tcPr>
-            <w:tcW w:type="dxa" w:w="4306"/>
+            <w:tcW w:type="dxa" w:w="8874"/>
           </w:tcPr>
           <w:p>
             <w:pPr>
@@ -3179,7 +3244,7 @@
         <w:trPr/>
         <w:tc>
           <w:tcPr>
-            <w:tcW w:type="dxa" w:w="445"/>
+            <w:tcW w:type="dxa" w:w="918"/>
           </w:tcPr>
           <w:p>
             <w:pPr>
@@ -3195,7 +3260,7 @@
         </w:tc>
         <w:tc>
           <w:tcPr>
-            <w:tcW w:type="dxa" w:w="4306"/>
+            <w:tcW w:type="dxa" w:w="8874"/>
           </w:tcPr>
           <w:p>
             <w:pPr>
@@ -3214,7 +3279,7 @@
         <w:trPr/>
         <w:tc>
           <w:tcPr>
-            <w:tcW w:type="dxa" w:w="445"/>
+            <w:tcW w:type="dxa" w:w="918"/>
           </w:tcPr>
           <w:p>
             <w:pPr>
@@ -3230,7 +3295,7 @@
         </w:tc>
         <w:tc>
           <w:tcPr>
-            <w:tcW w:type="dxa" w:w="4306"/>
+            <w:tcW w:type="dxa" w:w="8874"/>
           </w:tcPr>
           <w:p>
             <w:pPr>
@@ -3249,7 +3314,7 @@
         <w:trPr/>
         <w:tc>
           <w:tcPr>
-            <w:tcW w:type="dxa" w:w="445"/>
+            <w:tcW w:type="dxa" w:w="918"/>
           </w:tcPr>
           <w:p>
             <w:pPr>
@@ -3265,7 +3330,7 @@
         </w:tc>
         <w:tc>
           <w:tcPr>
-            <w:tcW w:type="dxa" w:w="4306"/>
+            <w:tcW w:type="dxa" w:w="8874"/>
           </w:tcPr>
           <w:p>
             <w:pPr>
@@ -3284,7 +3349,7 @@
         <w:trPr/>
         <w:tc>
           <w:tcPr>
-            <w:tcW w:type="dxa" w:w="445"/>
+            <w:tcW w:type="dxa" w:w="918"/>
           </w:tcPr>
           <w:p>
             <w:pPr>
@@ -3300,7 +3365,7 @@
         </w:tc>
         <w:tc>
           <w:tcPr>
-            <w:tcW w:type="dxa" w:w="4306"/>
+            <w:tcW w:type="dxa" w:w="8874"/>
           </w:tcPr>
           <w:p>
             <w:pPr>
@@ -3319,7 +3384,7 @@
         <w:trPr/>
         <w:tc>
           <w:tcPr>
-            <w:tcW w:type="dxa" w:w="445"/>
+            <w:tcW w:type="dxa" w:w="918"/>
           </w:tcPr>
           <w:p>
             <w:pPr>
@@ -3335,7 +3400,7 @@
         </w:tc>
         <w:tc>
           <w:tcPr>
-            <w:tcW w:type="dxa" w:w="4306"/>
+            <w:tcW w:type="dxa" w:w="8874"/>
           </w:tcPr>
           <w:p>
             <w:pPr>
@@ -3354,7 +3419,7 @@
         <w:trPr/>
         <w:tc>
           <w:tcPr>
-            <w:tcW w:type="dxa" w:w="445"/>
+            <w:tcW w:type="dxa" w:w="918"/>
           </w:tcPr>
           <w:p>
             <w:pPr>
@@ -3370,7 +3435,7 @@
         </w:tc>
         <w:tc>
           <w:tcPr>
-            <w:tcW w:type="dxa" w:w="4306"/>
+            <w:tcW w:type="dxa" w:w="8874"/>
           </w:tcPr>
           <w:p>
             <w:pPr>
@@ -3389,6 +3454,17 @@
     <w:p/>
     <w:p>
       <w:pPr>
+        <w:sectPr>
+          <w:type w:val="continuous"/>
+          <w:pgSz w:w="12240" w:h="15840"/>
+          <w:pgMar w:top="1080" w:right="1037" w:bottom="1080" w:left="1037" w:header="720" w:footer="720" w:gutter="0"/>
+          <w:cols w:space="360" w:num="1"/>
+          <w:docGrid w:linePitch="360"/>
+        </w:sectPr>
+      </w:pPr>
+    </w:p>
+    <w:p>
+      <w:pPr>
         <w:spacing w:after="40" w:before="80"/>
         <w:jc w:val="left"/>
       </w:pPr>
@@ -3398,7 +3474,7 @@
           <w:i/>
           <w:sz w:val="20"/>
         </w:rPr>
-        <w:t>Workloads</w:t>
+        <w:t>B. Workloads</w:t>
       </w:r>
     </w:p>
     <w:p>
@@ -3765,7 +3841,7 @@
           <w:i/>
           <w:sz w:val="20"/>
         </w:rPr>
-        <w:t>Metrics</w:t>
+        <w:t>C. Metrics</w:t>
       </w:r>
     </w:p>
     <w:p>
@@ -3811,7 +3887,7 @@
           <w:i/>
           <w:sz w:val="20"/>
         </w:rPr>
-        <w:t>Centralized baseline</w:t>
+        <w:t>D. Centralized baseline</w:t>
       </w:r>
     </w:p>
     <w:p>
@@ -3832,15 +3908,15 @@
     <w:p>
       <w:pPr>
         <w:spacing w:after="40" w:before="120"/>
-        <w:jc w:val="left"/>
+        <w:jc w:val="center"/>
       </w:pPr>
       <w:r>
         <w:rPr>
           <w:b/>
           <w:i w:val="0"/>
-          <w:sz w:val="22"/>
-        </w:rPr>
-        <w:t>Results</w:t>
+          <w:sz w:val="20"/>
+        </w:rPr>
+        <w:t>VI. RESULTS</w:t>
       </w:r>
     </w:p>
     <w:p>
@@ -3868,7 +3944,7 @@
           <w:i/>
           <w:sz w:val="20"/>
         </w:rPr>
-        <w:t>Scaling with the number of writer nodes</w:t>
+        <w:t>A. Scaling with the number of writer nodes</w:t>
       </w:r>
     </w:p>
     <w:p>
@@ -3900,6 +3976,17 @@
         </w:rPr>
         <w:t>The hub sustains 1,478–1,737 events/s with a median of 0.62 ms at N=1, that is, 6.8× the ledger's saturated throughput at a small fraction of its latency. This is the measured price of removing the intermediary on this testbed; on a distributed chain the gap widens by the consensus term (Section VII). In the outage run the hub accepted 251 of 500 submissions before being stopped; the remaining 249 were refused, and the 251 accepted records existed only in the stopped process, so no third party could recover them. The equivalent failure for the ledger is loss of the chain itself, which a replicated deployment is designed to prevent; a single Ganache process does not demonstrate that property and we do not claim it from this experiment.</w:t>
       </w:r>
+    </w:p>
+    <w:p>
+      <w:pPr>
+        <w:sectPr>
+          <w:type w:val="continuous"/>
+          <w:pgSz w:w="12240" w:h="15840"/>
+          <w:pgMar w:top="1080" w:right="1037" w:bottom="1080" w:left="1037" w:header="720" w:footer="720" w:gutter="0"/>
+          <w:cols w:space="360" w:num="2"/>
+          <w:docGrid w:linePitch="360"/>
+        </w:sectPr>
+      </w:pPr>
     </w:p>
     <w:p>
       <w:pPr>
@@ -3936,7 +4023,7 @@
         <w:trPr/>
         <w:tc>
           <w:tcPr>
-            <w:tcW w:type="dxa" w:w="280"/>
+            <w:tcW w:type="dxa" w:w="576"/>
           </w:tcPr>
           <w:p>
             <w:pPr>
@@ -3952,7 +4039,7 @@
         </w:tc>
         <w:tc>
           <w:tcPr>
-            <w:tcW w:type="dxa" w:w="894"/>
+            <w:tcW w:type="dxa" w:w="1843"/>
           </w:tcPr>
           <w:p>
             <w:pPr>
@@ -3969,7 +4056,7 @@
         </w:tc>
         <w:tc>
           <w:tcPr>
-            <w:tcW w:type="dxa" w:w="615"/>
+            <w:tcW w:type="dxa" w:w="1267"/>
           </w:tcPr>
           <w:p>
             <w:pPr>
@@ -3985,7 +4072,7 @@
         </w:tc>
         <w:tc>
           <w:tcPr>
-            <w:tcW w:type="dxa" w:w="503"/>
+            <w:tcW w:type="dxa" w:w="1037"/>
           </w:tcPr>
           <w:p>
             <w:pPr>
@@ -4001,7 +4088,7 @@
         </w:tc>
         <w:tc>
           <w:tcPr>
-            <w:tcW w:type="dxa" w:w="503"/>
+            <w:tcW w:type="dxa" w:w="1037"/>
           </w:tcPr>
           <w:p>
             <w:pPr>
@@ -4017,7 +4104,7 @@
         </w:tc>
         <w:tc>
           <w:tcPr>
-            <w:tcW w:type="dxa" w:w="503"/>
+            <w:tcW w:type="dxa" w:w="1037"/>
           </w:tcPr>
           <w:p>
             <w:pPr>
@@ -4033,7 +4120,7 @@
         </w:tc>
         <w:tc>
           <w:tcPr>
-            <w:tcW w:type="dxa" w:w="894"/>
+            <w:tcW w:type="dxa" w:w="1843"/>
           </w:tcPr>
           <w:p>
             <w:pPr>
@@ -4050,7 +4137,7 @@
         </w:tc>
         <w:tc>
           <w:tcPr>
-            <w:tcW w:type="dxa" w:w="559"/>
+            <w:tcW w:type="dxa" w:w="1152"/>
           </w:tcPr>
           <w:p>
             <w:pPr>
@@ -4069,7 +4156,7 @@
         <w:trPr/>
         <w:tc>
           <w:tcPr>
-            <w:tcW w:type="dxa" w:w="280"/>
+            <w:tcW w:type="dxa" w:w="576"/>
           </w:tcPr>
           <w:p>
             <w:pPr>
@@ -4085,7 +4172,7 @@
         </w:tc>
         <w:tc>
           <w:tcPr>
-            <w:tcW w:type="dxa" w:w="894"/>
+            <w:tcW w:type="dxa" w:w="1843"/>
           </w:tcPr>
           <w:p>
             <w:pPr>
@@ -4101,7 +4188,7 @@
         </w:tc>
         <w:tc>
           <w:tcPr>
-            <w:tcW w:type="dxa" w:w="615"/>
+            <w:tcW w:type="dxa" w:w="1267"/>
           </w:tcPr>
           <w:p>
             <w:pPr>
@@ -4117,7 +4204,7 @@
         </w:tc>
         <w:tc>
           <w:tcPr>
-            <w:tcW w:type="dxa" w:w="503"/>
+            <w:tcW w:type="dxa" w:w="1037"/>
           </w:tcPr>
           <w:p>
             <w:pPr>
@@ -4133,7 +4220,7 @@
         </w:tc>
         <w:tc>
           <w:tcPr>
-            <w:tcW w:type="dxa" w:w="503"/>
+            <w:tcW w:type="dxa" w:w="1037"/>
           </w:tcPr>
           <w:p>
             <w:pPr>
@@ -4149,7 +4236,7 @@
         </w:tc>
         <w:tc>
           <w:tcPr>
-            <w:tcW w:type="dxa" w:w="503"/>
+            <w:tcW w:type="dxa" w:w="1037"/>
           </w:tcPr>
           <w:p>
             <w:pPr>
@@ -4165,7 +4252,7 @@
         </w:tc>
         <w:tc>
           <w:tcPr>
-            <w:tcW w:type="dxa" w:w="894"/>
+            <w:tcW w:type="dxa" w:w="1843"/>
           </w:tcPr>
           <w:p>
             <w:pPr>
@@ -4181,7 +4268,7 @@
         </w:tc>
         <w:tc>
           <w:tcPr>
-            <w:tcW w:type="dxa" w:w="559"/>
+            <w:tcW w:type="dxa" w:w="1152"/>
           </w:tcPr>
           <w:p>
             <w:pPr>
@@ -4200,7 +4287,7 @@
         <w:trPr/>
         <w:tc>
           <w:tcPr>
-            <w:tcW w:type="dxa" w:w="280"/>
+            <w:tcW w:type="dxa" w:w="576"/>
           </w:tcPr>
           <w:p>
             <w:pPr>
@@ -4216,7 +4303,7 @@
         </w:tc>
         <w:tc>
           <w:tcPr>
-            <w:tcW w:type="dxa" w:w="894"/>
+            <w:tcW w:type="dxa" w:w="1843"/>
           </w:tcPr>
           <w:p>
             <w:pPr>
@@ -4232,7 +4319,7 @@
         </w:tc>
         <w:tc>
           <w:tcPr>
-            <w:tcW w:type="dxa" w:w="615"/>
+            <w:tcW w:type="dxa" w:w="1267"/>
           </w:tcPr>
           <w:p>
             <w:pPr>
@@ -4248,7 +4335,7 @@
         </w:tc>
         <w:tc>
           <w:tcPr>
-            <w:tcW w:type="dxa" w:w="503"/>
+            <w:tcW w:type="dxa" w:w="1037"/>
           </w:tcPr>
           <w:p>
             <w:pPr>
@@ -4264,7 +4351,7 @@
         </w:tc>
         <w:tc>
           <w:tcPr>
-            <w:tcW w:type="dxa" w:w="503"/>
+            <w:tcW w:type="dxa" w:w="1037"/>
           </w:tcPr>
           <w:p>
             <w:pPr>
@@ -4280,7 +4367,7 @@
         </w:tc>
         <w:tc>
           <w:tcPr>
-            <w:tcW w:type="dxa" w:w="503"/>
+            <w:tcW w:type="dxa" w:w="1037"/>
           </w:tcPr>
           <w:p>
             <w:pPr>
@@ -4296,7 +4383,7 @@
         </w:tc>
         <w:tc>
           <w:tcPr>
-            <w:tcW w:type="dxa" w:w="894"/>
+            <w:tcW w:type="dxa" w:w="1843"/>
           </w:tcPr>
           <w:p>
             <w:pPr>
@@ -4312,7 +4399,7 @@
         </w:tc>
         <w:tc>
           <w:tcPr>
-            <w:tcW w:type="dxa" w:w="559"/>
+            <w:tcW w:type="dxa" w:w="1152"/>
           </w:tcPr>
           <w:p>
             <w:pPr>
@@ -4331,7 +4418,7 @@
         <w:trPr/>
         <w:tc>
           <w:tcPr>
-            <w:tcW w:type="dxa" w:w="280"/>
+            <w:tcW w:type="dxa" w:w="576"/>
           </w:tcPr>
           <w:p>
             <w:pPr>
@@ -4347,7 +4434,7 @@
         </w:tc>
         <w:tc>
           <w:tcPr>
-            <w:tcW w:type="dxa" w:w="894"/>
+            <w:tcW w:type="dxa" w:w="1843"/>
           </w:tcPr>
           <w:p>
             <w:pPr>
@@ -4363,7 +4450,7 @@
         </w:tc>
         <w:tc>
           <w:tcPr>
-            <w:tcW w:type="dxa" w:w="615"/>
+            <w:tcW w:type="dxa" w:w="1267"/>
           </w:tcPr>
           <w:p>
             <w:pPr>
@@ -4379,7 +4466,7 @@
         </w:tc>
         <w:tc>
           <w:tcPr>
-            <w:tcW w:type="dxa" w:w="503"/>
+            <w:tcW w:type="dxa" w:w="1037"/>
           </w:tcPr>
           <w:p>
             <w:pPr>
@@ -4395,7 +4482,7 @@
         </w:tc>
         <w:tc>
           <w:tcPr>
-            <w:tcW w:type="dxa" w:w="503"/>
+            <w:tcW w:type="dxa" w:w="1037"/>
           </w:tcPr>
           <w:p>
             <w:pPr>
@@ -4411,7 +4498,7 @@
         </w:tc>
         <w:tc>
           <w:tcPr>
-            <w:tcW w:type="dxa" w:w="503"/>
+            <w:tcW w:type="dxa" w:w="1037"/>
           </w:tcPr>
           <w:p>
             <w:pPr>
@@ -4427,7 +4514,7 @@
         </w:tc>
         <w:tc>
           <w:tcPr>
-            <w:tcW w:type="dxa" w:w="894"/>
+            <w:tcW w:type="dxa" w:w="1843"/>
           </w:tcPr>
           <w:p>
             <w:pPr>
@@ -4443,7 +4530,7 @@
         </w:tc>
         <w:tc>
           <w:tcPr>
-            <w:tcW w:type="dxa" w:w="559"/>
+            <w:tcW w:type="dxa" w:w="1152"/>
           </w:tcPr>
           <w:p>
             <w:pPr>
@@ -4462,7 +4549,7 @@
         <w:trPr/>
         <w:tc>
           <w:tcPr>
-            <w:tcW w:type="dxa" w:w="280"/>
+            <w:tcW w:type="dxa" w:w="576"/>
           </w:tcPr>
           <w:p>
             <w:pPr>
@@ -4478,7 +4565,7 @@
         </w:tc>
         <w:tc>
           <w:tcPr>
-            <w:tcW w:type="dxa" w:w="894"/>
+            <w:tcW w:type="dxa" w:w="1843"/>
           </w:tcPr>
           <w:p>
             <w:pPr>
@@ -4494,7 +4581,7 @@
         </w:tc>
         <w:tc>
           <w:tcPr>
-            <w:tcW w:type="dxa" w:w="615"/>
+            <w:tcW w:type="dxa" w:w="1267"/>
           </w:tcPr>
           <w:p>
             <w:pPr>
@@ -4510,7 +4597,7 @@
         </w:tc>
         <w:tc>
           <w:tcPr>
-            <w:tcW w:type="dxa" w:w="503"/>
+            <w:tcW w:type="dxa" w:w="1037"/>
           </w:tcPr>
           <w:p>
             <w:pPr>
@@ -4526,7 +4613,7 @@
         </w:tc>
         <w:tc>
           <w:tcPr>
-            <w:tcW w:type="dxa" w:w="503"/>
+            <w:tcW w:type="dxa" w:w="1037"/>
           </w:tcPr>
           <w:p>
             <w:pPr>
@@ -4542,7 +4629,7 @@
         </w:tc>
         <w:tc>
           <w:tcPr>
-            <w:tcW w:type="dxa" w:w="503"/>
+            <w:tcW w:type="dxa" w:w="1037"/>
           </w:tcPr>
           <w:p>
             <w:pPr>
@@ -4558,7 +4645,7 @@
         </w:tc>
         <w:tc>
           <w:tcPr>
-            <w:tcW w:type="dxa" w:w="894"/>
+            <w:tcW w:type="dxa" w:w="1843"/>
           </w:tcPr>
           <w:p>
             <w:pPr>
@@ -4574,7 +4661,7 @@
         </w:tc>
         <w:tc>
           <w:tcPr>
-            <w:tcW w:type="dxa" w:w="559"/>
+            <w:tcW w:type="dxa" w:w="1152"/>
           </w:tcPr>
           <w:p>
             <w:pPr>
@@ -4593,7 +4680,7 @@
         <w:trPr/>
         <w:tc>
           <w:tcPr>
-            <w:tcW w:type="dxa" w:w="280"/>
+            <w:tcW w:type="dxa" w:w="576"/>
           </w:tcPr>
           <w:p>
             <w:pPr>
@@ -4609,7 +4696,7 @@
         </w:tc>
         <w:tc>
           <w:tcPr>
-            <w:tcW w:type="dxa" w:w="894"/>
+            <w:tcW w:type="dxa" w:w="1843"/>
           </w:tcPr>
           <w:p>
             <w:pPr>
@@ -4625,7 +4712,7 @@
         </w:tc>
         <w:tc>
           <w:tcPr>
-            <w:tcW w:type="dxa" w:w="615"/>
+            <w:tcW w:type="dxa" w:w="1267"/>
           </w:tcPr>
           <w:p>
             <w:pPr>
@@ -4641,7 +4728,7 @@
         </w:tc>
         <w:tc>
           <w:tcPr>
-            <w:tcW w:type="dxa" w:w="503"/>
+            <w:tcW w:type="dxa" w:w="1037"/>
           </w:tcPr>
           <w:p>
             <w:pPr>
@@ -4657,7 +4744,7 @@
         </w:tc>
         <w:tc>
           <w:tcPr>
-            <w:tcW w:type="dxa" w:w="503"/>
+            <w:tcW w:type="dxa" w:w="1037"/>
           </w:tcPr>
           <w:p>
             <w:pPr>
@@ -4673,7 +4760,7 @@
         </w:tc>
         <w:tc>
           <w:tcPr>
-            <w:tcW w:type="dxa" w:w="503"/>
+            <w:tcW w:type="dxa" w:w="1037"/>
           </w:tcPr>
           <w:p>
             <w:pPr>
@@ -4689,7 +4776,7 @@
         </w:tc>
         <w:tc>
           <w:tcPr>
-            <w:tcW w:type="dxa" w:w="894"/>
+            <w:tcW w:type="dxa" w:w="1843"/>
           </w:tcPr>
           <w:p>
             <w:pPr>
@@ -4705,7 +4792,7 @@
         </w:tc>
         <w:tc>
           <w:tcPr>
-            <w:tcW w:type="dxa" w:w="559"/>
+            <w:tcW w:type="dxa" w:w="1152"/>
           </w:tcPr>
           <w:p>
             <w:pPr>
@@ -4724,7 +4811,7 @@
         <w:trPr/>
         <w:tc>
           <w:tcPr>
-            <w:tcW w:type="dxa" w:w="280"/>
+            <w:tcW w:type="dxa" w:w="576"/>
           </w:tcPr>
           <w:p>
             <w:pPr>
@@ -4740,7 +4827,7 @@
         </w:tc>
         <w:tc>
           <w:tcPr>
-            <w:tcW w:type="dxa" w:w="894"/>
+            <w:tcW w:type="dxa" w:w="1843"/>
           </w:tcPr>
           <w:p>
             <w:pPr>
@@ -4756,7 +4843,7 @@
         </w:tc>
         <w:tc>
           <w:tcPr>
-            <w:tcW w:type="dxa" w:w="615"/>
+            <w:tcW w:type="dxa" w:w="1267"/>
           </w:tcPr>
           <w:p>
             <w:pPr>
@@ -4772,7 +4859,7 @@
         </w:tc>
         <w:tc>
           <w:tcPr>
-            <w:tcW w:type="dxa" w:w="503"/>
+            <w:tcW w:type="dxa" w:w="1037"/>
           </w:tcPr>
           <w:p>
             <w:pPr>
@@ -4788,7 +4875,7 @@
         </w:tc>
         <w:tc>
           <w:tcPr>
-            <w:tcW w:type="dxa" w:w="503"/>
+            <w:tcW w:type="dxa" w:w="1037"/>
           </w:tcPr>
           <w:p>
             <w:pPr>
@@ -4804,7 +4891,7 @@
         </w:tc>
         <w:tc>
           <w:tcPr>
-            <w:tcW w:type="dxa" w:w="503"/>
+            <w:tcW w:type="dxa" w:w="1037"/>
           </w:tcPr>
           <w:p>
             <w:pPr>
@@ -4820,7 +4907,7 @@
         </w:tc>
         <w:tc>
           <w:tcPr>
-            <w:tcW w:type="dxa" w:w="894"/>
+            <w:tcW w:type="dxa" w:w="1843"/>
           </w:tcPr>
           <w:p>
             <w:pPr>
@@ -4836,7 +4923,7 @@
         </w:tc>
         <w:tc>
           <w:tcPr>
-            <w:tcW w:type="dxa" w:w="559"/>
+            <w:tcW w:type="dxa" w:w="1152"/>
           </w:tcPr>
           <w:p>
             <w:pPr>
@@ -4853,6 +4940,17 @@
       </w:tr>
     </w:tbl>
     <w:p/>
+    <w:p>
+      <w:pPr>
+        <w:sectPr>
+          <w:type w:val="continuous"/>
+          <w:pgSz w:w="12240" w:h="15840"/>
+          <w:pgMar w:top="1080" w:right="1037" w:bottom="1080" w:left="1037" w:header="720" w:footer="720" w:gutter="0"/>
+          <w:cols w:space="360" w:num="1"/>
+          <w:docGrid w:linePitch="360"/>
+        </w:sectPr>
+      </w:pPr>
+    </w:p>
     <w:p>
       <w:pPr>
         <w:jc w:val="center"/>
@@ -4917,7 +5015,7 @@
           <w:i/>
           <w:sz w:val="20"/>
         </w:rPr>
-        <w:t>Gas cost, encoding and batching</w:t>
+        <w:t>B. Gas cost, encoding and batching</w:t>
       </w:r>
     </w:p>
     <w:p>
@@ -4934,6 +5032,17 @@
         </w:rPr>
         <w:t>Table IV reports E2. Measured gas equals the EIP-2028 model (4) to the unit for both encodings: 22,120 for the 70-byte ASCII tag and 21,545 for the 35-byte binary tag, a saving of 2.6%. The intrinsic 21,000 gas dominates; calldata contributes only 1,120 gas even for the ASCII tag, so shrinking the tag has limited effect and batching is the lever that matters. With B digests per transaction the gas per IOC falls as g/B (Fig. 3), from 21,552 at B=1 to 337 at B=64; per-transaction gas is constant at 21,554 because the root is 32 bytes regardless of B. All 1,270 membership proofs verified, and proof size grows as 32⌈log2 B⌉ bytes, from 0 at B=1 to 192 bytes at B=64. Per-IOC latency falls proportionally, from 8.72 ms to 0.12 ms, at the cost of holding IOCs until a batch fills.</w:t>
       </w:r>
+    </w:p>
+    <w:p>
+      <w:pPr>
+        <w:sectPr>
+          <w:type w:val="continuous"/>
+          <w:pgSz w:w="12240" w:h="15840"/>
+          <w:pgMar w:top="1080" w:right="1037" w:bottom="1080" w:left="1037" w:header="720" w:footer="720" w:gutter="0"/>
+          <w:cols w:space="360" w:num="2"/>
+          <w:docGrid w:linePitch="360"/>
+        </w:sectPr>
+      </w:pPr>
     </w:p>
     <w:p>
       <w:pPr>
@@ -4967,7 +5076,7 @@
         <w:trPr/>
         <w:tc>
           <w:tcPr>
-            <w:tcW w:type="dxa" w:w="1449"/>
+            <w:tcW w:type="dxa" w:w="2985"/>
           </w:tcPr>
           <w:p>
             <w:pPr>
@@ -4984,7 +5093,7 @@
         </w:tc>
         <w:tc>
           <w:tcPr>
-            <w:tcW w:type="dxa" w:w="637"/>
+            <w:tcW w:type="dxa" w:w="1314"/>
           </w:tcPr>
           <w:p>
             <w:pPr>
@@ -5001,7 +5110,7 @@
         </w:tc>
         <w:tc>
           <w:tcPr>
-            <w:tcW w:type="dxa" w:w="1101"/>
+            <w:tcW w:type="dxa" w:w="2269"/>
           </w:tcPr>
           <w:p>
             <w:pPr>
@@ -5018,7 +5127,7 @@
         </w:tc>
         <w:tc>
           <w:tcPr>
-            <w:tcW w:type="dxa" w:w="811"/>
+            <w:tcW w:type="dxa" w:w="1672"/>
           </w:tcPr>
           <w:p>
             <w:pPr>
@@ -5035,7 +5144,7 @@
         </w:tc>
         <w:tc>
           <w:tcPr>
-            <w:tcW w:type="dxa" w:w="753"/>
+            <w:tcW w:type="dxa" w:w="1552"/>
           </w:tcPr>
           <w:p>
             <w:pPr>
@@ -5055,7 +5164,7 @@
         <w:trPr/>
         <w:tc>
           <w:tcPr>
-            <w:tcW w:type="dxa" w:w="1449"/>
+            <w:tcW w:type="dxa" w:w="2985"/>
           </w:tcPr>
           <w:p>
             <w:pPr>
@@ -5071,7 +5180,7 @@
         </w:tc>
         <w:tc>
           <w:tcPr>
-            <w:tcW w:type="dxa" w:w="637"/>
+            <w:tcW w:type="dxa" w:w="1314"/>
           </w:tcPr>
           <w:p>
             <w:pPr>
@@ -5087,7 +5196,7 @@
         </w:tc>
         <w:tc>
           <w:tcPr>
-            <w:tcW w:type="dxa" w:w="1101"/>
+            <w:tcW w:type="dxa" w:w="2269"/>
           </w:tcPr>
           <w:p>
             <w:pPr>
@@ -5103,7 +5212,7 @@
         </w:tc>
         <w:tc>
           <w:tcPr>
-            <w:tcW w:type="dxa" w:w="811"/>
+            <w:tcW w:type="dxa" w:w="1672"/>
           </w:tcPr>
           <w:p>
             <w:pPr>
@@ -5119,7 +5228,7 @@
         </w:tc>
         <w:tc>
           <w:tcPr>
-            <w:tcW w:type="dxa" w:w="753"/>
+            <w:tcW w:type="dxa" w:w="1552"/>
           </w:tcPr>
           <w:p>
             <w:pPr>
@@ -5138,7 +5247,7 @@
         <w:trPr/>
         <w:tc>
           <w:tcPr>
-            <w:tcW w:type="dxa" w:w="1449"/>
+            <w:tcW w:type="dxa" w:w="2985"/>
           </w:tcPr>
           <w:p>
             <w:pPr>
@@ -5154,7 +5263,7 @@
         </w:tc>
         <w:tc>
           <w:tcPr>
-            <w:tcW w:type="dxa" w:w="637"/>
+            <w:tcW w:type="dxa" w:w="1314"/>
           </w:tcPr>
           <w:p>
             <w:pPr>
@@ -5170,7 +5279,7 @@
         </w:tc>
         <w:tc>
           <w:tcPr>
-            <w:tcW w:type="dxa" w:w="1101"/>
+            <w:tcW w:type="dxa" w:w="2269"/>
           </w:tcPr>
           <w:p>
             <w:pPr>
@@ -5186,7 +5295,7 @@
         </w:tc>
         <w:tc>
           <w:tcPr>
-            <w:tcW w:type="dxa" w:w="811"/>
+            <w:tcW w:type="dxa" w:w="1672"/>
           </w:tcPr>
           <w:p>
             <w:pPr>
@@ -5202,7 +5311,7 @@
         </w:tc>
         <w:tc>
           <w:tcPr>
-            <w:tcW w:type="dxa" w:w="753"/>
+            <w:tcW w:type="dxa" w:w="1552"/>
           </w:tcPr>
           <w:p>
             <w:pPr>
@@ -5221,7 +5330,7 @@
         <w:trPr/>
         <w:tc>
           <w:tcPr>
-            <w:tcW w:type="dxa" w:w="1449"/>
+            <w:tcW w:type="dxa" w:w="2985"/>
           </w:tcPr>
           <w:p>
             <w:pPr>
@@ -5237,7 +5346,7 @@
         </w:tc>
         <w:tc>
           <w:tcPr>
-            <w:tcW w:type="dxa" w:w="637"/>
+            <w:tcW w:type="dxa" w:w="1314"/>
           </w:tcPr>
           <w:p>
             <w:pPr>
@@ -5253,7 +5362,7 @@
         </w:tc>
         <w:tc>
           <w:tcPr>
-            <w:tcW w:type="dxa" w:w="1101"/>
+            <w:tcW w:type="dxa" w:w="2269"/>
           </w:tcPr>
           <w:p>
             <w:pPr>
@@ -5269,7 +5378,7 @@
         </w:tc>
         <w:tc>
           <w:tcPr>
-            <w:tcW w:type="dxa" w:w="811"/>
+            <w:tcW w:type="dxa" w:w="1672"/>
           </w:tcPr>
           <w:p>
             <w:pPr>
@@ -5285,7 +5394,7 @@
         </w:tc>
         <w:tc>
           <w:tcPr>
-            <w:tcW w:type="dxa" w:w="753"/>
+            <w:tcW w:type="dxa" w:w="1552"/>
           </w:tcPr>
           <w:p>
             <w:pPr>
@@ -5304,7 +5413,7 @@
         <w:trPr/>
         <w:tc>
           <w:tcPr>
-            <w:tcW w:type="dxa" w:w="1449"/>
+            <w:tcW w:type="dxa" w:w="2985"/>
           </w:tcPr>
           <w:p>
             <w:pPr>
@@ -5320,7 +5429,7 @@
         </w:tc>
         <w:tc>
           <w:tcPr>
-            <w:tcW w:type="dxa" w:w="637"/>
+            <w:tcW w:type="dxa" w:w="1314"/>
           </w:tcPr>
           <w:p>
             <w:pPr>
@@ -5336,7 +5445,7 @@
         </w:tc>
         <w:tc>
           <w:tcPr>
-            <w:tcW w:type="dxa" w:w="1101"/>
+            <w:tcW w:type="dxa" w:w="2269"/>
           </w:tcPr>
           <w:p>
             <w:pPr>
@@ -5352,7 +5461,7 @@
         </w:tc>
         <w:tc>
           <w:tcPr>
-            <w:tcW w:type="dxa" w:w="811"/>
+            <w:tcW w:type="dxa" w:w="1672"/>
           </w:tcPr>
           <w:p>
             <w:pPr>
@@ -5368,7 +5477,7 @@
         </w:tc>
         <w:tc>
           <w:tcPr>
-            <w:tcW w:type="dxa" w:w="753"/>
+            <w:tcW w:type="dxa" w:w="1552"/>
           </w:tcPr>
           <w:p>
             <w:pPr>
@@ -5387,7 +5496,7 @@
         <w:trPr/>
         <w:tc>
           <w:tcPr>
-            <w:tcW w:type="dxa" w:w="1449"/>
+            <w:tcW w:type="dxa" w:w="2985"/>
           </w:tcPr>
           <w:p>
             <w:pPr>
@@ -5403,7 +5512,7 @@
         </w:tc>
         <w:tc>
           <w:tcPr>
-            <w:tcW w:type="dxa" w:w="637"/>
+            <w:tcW w:type="dxa" w:w="1314"/>
           </w:tcPr>
           <w:p>
             <w:pPr>
@@ -5419,7 +5528,7 @@
         </w:tc>
         <w:tc>
           <w:tcPr>
-            <w:tcW w:type="dxa" w:w="1101"/>
+            <w:tcW w:type="dxa" w:w="2269"/>
           </w:tcPr>
           <w:p>
             <w:pPr>
@@ -5435,7 +5544,7 @@
         </w:tc>
         <w:tc>
           <w:tcPr>
-            <w:tcW w:type="dxa" w:w="811"/>
+            <w:tcW w:type="dxa" w:w="1672"/>
           </w:tcPr>
           <w:p>
             <w:pPr>
@@ -5451,7 +5560,7 @@
         </w:tc>
         <w:tc>
           <w:tcPr>
-            <w:tcW w:type="dxa" w:w="753"/>
+            <w:tcW w:type="dxa" w:w="1552"/>
           </w:tcPr>
           <w:p>
             <w:pPr>
@@ -5468,6 +5577,17 @@
       </w:tr>
     </w:tbl>
     <w:p/>
+    <w:p>
+      <w:pPr>
+        <w:sectPr>
+          <w:type w:val="continuous"/>
+          <w:pgSz w:w="12240" w:h="15840"/>
+          <w:pgMar w:top="1080" w:right="1037" w:bottom="1080" w:left="1037" w:header="720" w:footer="720" w:gutter="0"/>
+          <w:cols w:space="360" w:num="1"/>
+          <w:docGrid w:linePitch="360"/>
+        </w:sectPr>
+      </w:pPr>
+    </w:p>
     <w:p>
       <w:pPr>
         <w:jc w:val="center"/>
@@ -5532,7 +5652,7 @@
           <w:i/>
           <w:sz w:val="20"/>
         </w:rPr>
-        <w:t>Bootstrap cost</w:t>
+        <w:t>C. Bootstrap cost</w:t>
       </w:r>
     </w:p>
     <w:p>
@@ -5631,7 +5751,7 @@
           <w:i/>
           <w:sz w:val="20"/>
         </w:rPr>
-        <w:t>Corroboration accuracy under per-target variation</w:t>
+        <w:t>D. Corroboration accuracy under per-target variation</w:t>
       </w:r>
     </w:p>
     <w:p>
@@ -5682,6 +5802,17 @@
         </w:rPr>
         <w:t xml:space="preserve"> = 0.89); its misses are the net campaigns, whose sources span unrelated prefixes and which no address-based key can join. No single keying function is adequate for every campaign shape.</w:t>
       </w:r>
+    </w:p>
+    <w:p>
+      <w:pPr>
+        <w:sectPr>
+          <w:type w:val="continuous"/>
+          <w:pgSz w:w="12240" w:h="15840"/>
+          <w:pgMar w:top="1080" w:right="1037" w:bottom="1080" w:left="1037" w:header="720" w:footer="720" w:gutter="0"/>
+          <w:cols w:space="360" w:num="2"/>
+          <w:docGrid w:linePitch="360"/>
+        </w:sectPr>
+      </w:pPr>
     </w:p>
     <w:p>
       <w:pPr>
@@ -5715,7 +5846,7 @@
         <w:trPr/>
         <w:tc>
           <w:tcPr>
-            <w:tcW w:type="dxa" w:w="1018"/>
+            <w:tcW w:type="dxa" w:w="2098"/>
           </w:tcPr>
           <w:p>
             <w:pPr>
@@ -5732,7 +5863,7 @@
         </w:tc>
         <w:tc>
           <w:tcPr>
-            <w:tcW w:type="dxa" w:w="1018"/>
+            <w:tcW w:type="dxa" w:w="2098"/>
           </w:tcPr>
           <w:p>
             <w:pPr>
@@ -5749,7 +5880,7 @@
         </w:tc>
         <w:tc>
           <w:tcPr>
-            <w:tcW w:type="dxa" w:w="905"/>
+            <w:tcW w:type="dxa" w:w="1865"/>
           </w:tcPr>
           <w:p>
             <w:pPr>
@@ -5766,7 +5897,7 @@
         </w:tc>
         <w:tc>
           <w:tcPr>
-            <w:tcW w:type="dxa" w:w="905"/>
+            <w:tcW w:type="dxa" w:w="1865"/>
           </w:tcPr>
           <w:p>
             <w:pPr>
@@ -5783,7 +5914,7 @@
         </w:tc>
         <w:tc>
           <w:tcPr>
-            <w:tcW w:type="dxa" w:w="905"/>
+            <w:tcW w:type="dxa" w:w="1865"/>
           </w:tcPr>
           <w:p>
             <w:pPr>
@@ -5803,7 +5934,7 @@
         <w:trPr/>
         <w:tc>
           <w:tcPr>
-            <w:tcW w:type="dxa" w:w="1018"/>
+            <w:tcW w:type="dxa" w:w="2098"/>
           </w:tcPr>
           <w:p>
             <w:pPr>
@@ -5819,7 +5950,7 @@
         </w:tc>
         <w:tc>
           <w:tcPr>
-            <w:tcW w:type="dxa" w:w="1018"/>
+            <w:tcW w:type="dxa" w:w="2098"/>
           </w:tcPr>
           <w:p>
             <w:pPr>
@@ -5835,7 +5966,7 @@
         </w:tc>
         <w:tc>
           <w:tcPr>
-            <w:tcW w:type="dxa" w:w="905"/>
+            <w:tcW w:type="dxa" w:w="1865"/>
           </w:tcPr>
           <w:p>
             <w:pPr>
@@ -5851,7 +5982,7 @@
         </w:tc>
         <w:tc>
           <w:tcPr>
-            <w:tcW w:type="dxa" w:w="905"/>
+            <w:tcW w:type="dxa" w:w="1865"/>
           </w:tcPr>
           <w:p>
             <w:pPr>
@@ -5867,7 +5998,7 @@
         </w:tc>
         <w:tc>
           <w:tcPr>
-            <w:tcW w:type="dxa" w:w="905"/>
+            <w:tcW w:type="dxa" w:w="1865"/>
           </w:tcPr>
           <w:p>
             <w:pPr>
@@ -5886,7 +6017,7 @@
         <w:trPr/>
         <w:tc>
           <w:tcPr>
-            <w:tcW w:type="dxa" w:w="1018"/>
+            <w:tcW w:type="dxa" w:w="2098"/>
           </w:tcPr>
           <w:p>
             <w:pPr>
@@ -5902,7 +6033,7 @@
         </w:tc>
         <w:tc>
           <w:tcPr>
-            <w:tcW w:type="dxa" w:w="1018"/>
+            <w:tcW w:type="dxa" w:w="2098"/>
           </w:tcPr>
           <w:p>
             <w:pPr>
@@ -5918,7 +6049,7 @@
         </w:tc>
         <w:tc>
           <w:tcPr>
-            <w:tcW w:type="dxa" w:w="905"/>
+            <w:tcW w:type="dxa" w:w="1865"/>
           </w:tcPr>
           <w:p>
             <w:pPr>
@@ -5934,7 +6065,7 @@
         </w:tc>
         <w:tc>
           <w:tcPr>
-            <w:tcW w:type="dxa" w:w="905"/>
+            <w:tcW w:type="dxa" w:w="1865"/>
           </w:tcPr>
           <w:p>
             <w:pPr>
@@ -5950,7 +6081,7 @@
         </w:tc>
         <w:tc>
           <w:tcPr>
-            <w:tcW w:type="dxa" w:w="905"/>
+            <w:tcW w:type="dxa" w:w="1865"/>
           </w:tcPr>
           <w:p>
             <w:pPr>
@@ -5969,7 +6100,7 @@
         <w:trPr/>
         <w:tc>
           <w:tcPr>
-            <w:tcW w:type="dxa" w:w="1018"/>
+            <w:tcW w:type="dxa" w:w="2098"/>
           </w:tcPr>
           <w:p>
             <w:pPr>
@@ -5985,7 +6116,7 @@
         </w:tc>
         <w:tc>
           <w:tcPr>
-            <w:tcW w:type="dxa" w:w="1018"/>
+            <w:tcW w:type="dxa" w:w="2098"/>
           </w:tcPr>
           <w:p>
             <w:pPr>
@@ -6001,7 +6132,7 @@
         </w:tc>
         <w:tc>
           <w:tcPr>
-            <w:tcW w:type="dxa" w:w="905"/>
+            <w:tcW w:type="dxa" w:w="1865"/>
           </w:tcPr>
           <w:p>
             <w:pPr>
@@ -6017,7 +6148,7 @@
         </w:tc>
         <w:tc>
           <w:tcPr>
-            <w:tcW w:type="dxa" w:w="905"/>
+            <w:tcW w:type="dxa" w:w="1865"/>
           </w:tcPr>
           <w:p>
             <w:pPr>
@@ -6033,7 +6164,7 @@
         </w:tc>
         <w:tc>
           <w:tcPr>
-            <w:tcW w:type="dxa" w:w="905"/>
+            <w:tcW w:type="dxa" w:w="1865"/>
           </w:tcPr>
           <w:p>
             <w:pPr>
@@ -6052,7 +6183,7 @@
         <w:trPr/>
         <w:tc>
           <w:tcPr>
-            <w:tcW w:type="dxa" w:w="1018"/>
+            <w:tcW w:type="dxa" w:w="2098"/>
           </w:tcPr>
           <w:p>
             <w:pPr>
@@ -6068,7 +6199,7 @@
         </w:tc>
         <w:tc>
           <w:tcPr>
-            <w:tcW w:type="dxa" w:w="1018"/>
+            <w:tcW w:type="dxa" w:w="2098"/>
           </w:tcPr>
           <w:p>
             <w:pPr>
@@ -6084,7 +6215,7 @@
         </w:tc>
         <w:tc>
           <w:tcPr>
-            <w:tcW w:type="dxa" w:w="905"/>
+            <w:tcW w:type="dxa" w:w="1865"/>
           </w:tcPr>
           <w:p>
             <w:pPr>
@@ -6100,7 +6231,7 @@
         </w:tc>
         <w:tc>
           <w:tcPr>
-            <w:tcW w:type="dxa" w:w="905"/>
+            <w:tcW w:type="dxa" w:w="1865"/>
           </w:tcPr>
           <w:p>
             <w:pPr>
@@ -6116,7 +6247,7 @@
         </w:tc>
         <w:tc>
           <w:tcPr>
-            <w:tcW w:type="dxa" w:w="905"/>
+            <w:tcW w:type="dxa" w:w="1865"/>
           </w:tcPr>
           <w:p>
             <w:pPr>
@@ -6133,6 +6264,17 @@
       </w:tr>
     </w:tbl>
     <w:p/>
+    <w:p>
+      <w:pPr>
+        <w:sectPr>
+          <w:type w:val="continuous"/>
+          <w:pgSz w:w="12240" w:h="15840"/>
+          <w:pgMar w:top="1080" w:right="1037" w:bottom="1080" w:left="1037" w:header="720" w:footer="720" w:gutter="0"/>
+          <w:cols w:space="360" w:num="1"/>
+          <w:docGrid w:linePitch="360"/>
+        </w:sectPr>
+      </w:pPr>
+    </w:p>
     <w:p>
       <w:pPr>
         <w:jc w:val="center"/>
@@ -6214,7 +6356,7 @@
           <w:i/>
           <w:sz w:val="20"/>
         </w:rPr>
-        <w:t>Adversarial writers</w:t>
+        <w:t>E. Adversarial writers</w:t>
       </w:r>
     </w:p>
     <w:p>
@@ -6280,6 +6422,17 @@
         </w:rPr>
         <w:t>. Under commit–reveal, with two honest nodes sharing 20 digests and three nodes holding 90 private ones, the echo node's 110 reveals were all rejected by (6), no private digest was falsely corroborated, and all 20 genuinely shared digests were still corroborated. The cost is 44,062 gas per IOC (2.0× the single-tag cost) and two inclusion latencies (9.0 and 8.3 ms mean).</w:t>
       </w:r>
+    </w:p>
+    <w:p>
+      <w:pPr>
+        <w:sectPr>
+          <w:type w:val="continuous"/>
+          <w:pgSz w:w="12240" w:h="15840"/>
+          <w:pgMar w:top="1080" w:right="1037" w:bottom="1080" w:left="1037" w:header="720" w:footer="720" w:gutter="0"/>
+          <w:cols w:space="360" w:num="2"/>
+          <w:docGrid w:linePitch="360"/>
+        </w:sectPr>
+      </w:pPr>
     </w:p>
     <w:p>
       <w:pPr>
@@ -6313,7 +6466,7 @@
         <w:trPr/>
         <w:tc>
           <w:tcPr>
-            <w:tcW w:type="dxa" w:w="4752"/>
+            <w:tcW w:type="dxa" w:w="9792"/>
             <w:gridSpan w:val="5"/>
           </w:tcPr>
           <w:p>
@@ -6334,7 +6487,7 @@
         <w:trPr/>
         <w:tc>
           <w:tcPr>
-            <w:tcW w:type="dxa" w:w="2571"/>
+            <w:tcW w:type="dxa" w:w="5297"/>
           </w:tcPr>
           <w:p>
             <w:pPr>
@@ -6350,7 +6503,7 @@
         </w:tc>
         <w:tc>
           <w:tcPr>
-            <w:tcW w:type="dxa" w:w="857"/>
+            <w:tcW w:type="dxa" w:w="1766"/>
           </w:tcPr>
           <w:p>
             <w:pPr>
@@ -6365,7 +6518,7 @@
         </w:tc>
         <w:tc>
           <w:tcPr>
-            <w:tcW w:type="dxa" w:w="428"/>
+            <w:tcW w:type="dxa" w:w="883"/>
           </w:tcPr>
           <w:p>
             <w:pPr>
@@ -6381,7 +6534,7 @@
         </w:tc>
         <w:tc>
           <w:tcPr>
-            <w:tcW w:type="dxa" w:w="351"/>
+            <w:tcW w:type="dxa" w:w="722"/>
           </w:tcPr>
           <w:p>
             <w:pPr>
@@ -6397,7 +6550,7 @@
         </w:tc>
         <w:tc>
           <w:tcPr>
-            <w:tcW w:type="dxa" w:w="545"/>
+            <w:tcW w:type="dxa" w:w="1124"/>
           </w:tcPr>
           <w:p>
             <w:pPr>
@@ -6416,7 +6569,7 @@
         <w:trPr/>
         <w:tc>
           <w:tcPr>
-            <w:tcW w:type="dxa" w:w="2571"/>
+            <w:tcW w:type="dxa" w:w="5297"/>
           </w:tcPr>
           <w:p>
             <w:pPr>
@@ -6432,7 +6585,7 @@
         </w:tc>
         <w:tc>
           <w:tcPr>
-            <w:tcW w:type="dxa" w:w="857"/>
+            <w:tcW w:type="dxa" w:w="1766"/>
           </w:tcPr>
           <w:p>
             <w:pPr>
@@ -6447,7 +6600,7 @@
         </w:tc>
         <w:tc>
           <w:tcPr>
-            <w:tcW w:type="dxa" w:w="428"/>
+            <w:tcW w:type="dxa" w:w="883"/>
           </w:tcPr>
           <w:p>
             <w:pPr>
@@ -6463,7 +6616,7 @@
         </w:tc>
         <w:tc>
           <w:tcPr>
-            <w:tcW w:type="dxa" w:w="351"/>
+            <w:tcW w:type="dxa" w:w="722"/>
           </w:tcPr>
           <w:p>
             <w:pPr>
@@ -6479,7 +6632,7 @@
         </w:tc>
         <w:tc>
           <w:tcPr>
-            <w:tcW w:type="dxa" w:w="545"/>
+            <w:tcW w:type="dxa" w:w="1124"/>
           </w:tcPr>
           <w:p>
             <w:pPr>
@@ -6498,7 +6651,7 @@
         <w:trPr/>
         <w:tc>
           <w:tcPr>
-            <w:tcW w:type="dxa" w:w="2571"/>
+            <w:tcW w:type="dxa" w:w="5297"/>
           </w:tcPr>
           <w:p>
             <w:pPr>
@@ -6514,7 +6667,7 @@
         </w:tc>
         <w:tc>
           <w:tcPr>
-            <w:tcW w:type="dxa" w:w="857"/>
+            <w:tcW w:type="dxa" w:w="1766"/>
           </w:tcPr>
           <w:p>
             <w:pPr>
@@ -6529,7 +6682,7 @@
         </w:tc>
         <w:tc>
           <w:tcPr>
-            <w:tcW w:type="dxa" w:w="428"/>
+            <w:tcW w:type="dxa" w:w="883"/>
           </w:tcPr>
           <w:p>
             <w:pPr>
@@ -6545,7 +6698,7 @@
         </w:tc>
         <w:tc>
           <w:tcPr>
-            <w:tcW w:type="dxa" w:w="351"/>
+            <w:tcW w:type="dxa" w:w="722"/>
           </w:tcPr>
           <w:p>
             <w:pPr>
@@ -6561,7 +6714,7 @@
         </w:tc>
         <w:tc>
           <w:tcPr>
-            <w:tcW w:type="dxa" w:w="545"/>
+            <w:tcW w:type="dxa" w:w="1124"/>
           </w:tcPr>
           <w:p>
             <w:pPr>
@@ -6580,7 +6733,7 @@
         <w:trPr/>
         <w:tc>
           <w:tcPr>
-            <w:tcW w:type="dxa" w:w="2571"/>
+            <w:tcW w:type="dxa" w:w="5297"/>
           </w:tcPr>
           <w:p>
             <w:pPr>
@@ -6596,7 +6749,7 @@
         </w:tc>
         <w:tc>
           <w:tcPr>
-            <w:tcW w:type="dxa" w:w="857"/>
+            <w:tcW w:type="dxa" w:w="1766"/>
           </w:tcPr>
           <w:p>
             <w:pPr>
@@ -6611,7 +6764,7 @@
         </w:tc>
         <w:tc>
           <w:tcPr>
-            <w:tcW w:type="dxa" w:w="428"/>
+            <w:tcW w:type="dxa" w:w="883"/>
           </w:tcPr>
           <w:p>
             <w:pPr>
@@ -6627,7 +6780,7 @@
         </w:tc>
         <w:tc>
           <w:tcPr>
-            <w:tcW w:type="dxa" w:w="351"/>
+            <w:tcW w:type="dxa" w:w="722"/>
           </w:tcPr>
           <w:p>
             <w:pPr>
@@ -6643,7 +6796,7 @@
         </w:tc>
         <w:tc>
           <w:tcPr>
-            <w:tcW w:type="dxa" w:w="545"/>
+            <w:tcW w:type="dxa" w:w="1124"/>
           </w:tcPr>
           <w:p>
             <w:pPr>
@@ -6662,7 +6815,7 @@
         <w:trPr/>
         <w:tc>
           <w:tcPr>
-            <w:tcW w:type="dxa" w:w="4752"/>
+            <w:tcW w:type="dxa" w:w="9792"/>
             <w:gridSpan w:val="5"/>
           </w:tcPr>
           <w:p>
@@ -6682,7 +6835,7 @@
         <w:trPr/>
         <w:tc>
           <w:tcPr>
-            <w:tcW w:type="dxa" w:w="2571"/>
+            <w:tcW w:type="dxa" w:w="5297"/>
           </w:tcPr>
           <w:p>
             <w:pPr>
@@ -6698,7 +6851,7 @@
         </w:tc>
         <w:tc>
           <w:tcPr>
-            <w:tcW w:type="dxa" w:w="857"/>
+            <w:tcW w:type="dxa" w:w="1766"/>
           </w:tcPr>
           <w:p>
             <w:pPr>
@@ -6714,7 +6867,7 @@
         </w:tc>
         <w:tc>
           <w:tcPr>
-            <w:tcW w:type="dxa" w:w="428"/>
+            <w:tcW w:type="dxa" w:w="883"/>
           </w:tcPr>
           <w:p>
             <w:pPr>
@@ -6730,7 +6883,7 @@
         </w:tc>
         <w:tc>
           <w:tcPr>
-            <w:tcW w:type="dxa" w:w="351"/>
+            <w:tcW w:type="dxa" w:w="722"/>
           </w:tcPr>
           <w:p>
             <w:pPr>
@@ -6746,7 +6899,7 @@
         </w:tc>
         <w:tc>
           <w:tcPr>
-            <w:tcW w:type="dxa" w:w="545"/>
+            <w:tcW w:type="dxa" w:w="1124"/>
           </w:tcPr>
           <w:p>
             <w:pPr>
@@ -6765,7 +6918,7 @@
         <w:trPr/>
         <w:tc>
           <w:tcPr>
-            <w:tcW w:type="dxa" w:w="2571"/>
+            <w:tcW w:type="dxa" w:w="5297"/>
           </w:tcPr>
           <w:p>
             <w:pPr>
@@ -6781,7 +6934,7 @@
         </w:tc>
         <w:tc>
           <w:tcPr>
-            <w:tcW w:type="dxa" w:w="857"/>
+            <w:tcW w:type="dxa" w:w="1766"/>
           </w:tcPr>
           <w:p>
             <w:pPr>
@@ -6797,7 +6950,7 @@
         </w:tc>
         <w:tc>
           <w:tcPr>
-            <w:tcW w:type="dxa" w:w="428"/>
+            <w:tcW w:type="dxa" w:w="883"/>
           </w:tcPr>
           <w:p>
             <w:pPr>
@@ -6813,7 +6966,7 @@
         </w:tc>
         <w:tc>
           <w:tcPr>
-            <w:tcW w:type="dxa" w:w="351"/>
+            <w:tcW w:type="dxa" w:w="722"/>
           </w:tcPr>
           <w:p>
             <w:pPr>
@@ -6829,7 +6982,7 @@
         </w:tc>
         <w:tc>
           <w:tcPr>
-            <w:tcW w:type="dxa" w:w="545"/>
+            <w:tcW w:type="dxa" w:w="1124"/>
           </w:tcPr>
           <w:p>
             <w:pPr>
@@ -6848,7 +7001,7 @@
         <w:trPr/>
         <w:tc>
           <w:tcPr>
-            <w:tcW w:type="dxa" w:w="2571"/>
+            <w:tcW w:type="dxa" w:w="5297"/>
           </w:tcPr>
           <w:p>
             <w:pPr>
@@ -6864,7 +7017,7 @@
         </w:tc>
         <w:tc>
           <w:tcPr>
-            <w:tcW w:type="dxa" w:w="857"/>
+            <w:tcW w:type="dxa" w:w="1766"/>
           </w:tcPr>
           <w:p>
             <w:pPr>
@@ -6880,7 +7033,7 @@
         </w:tc>
         <w:tc>
           <w:tcPr>
-            <w:tcW w:type="dxa" w:w="428"/>
+            <w:tcW w:type="dxa" w:w="883"/>
           </w:tcPr>
           <w:p>
             <w:pPr>
@@ -6896,7 +7049,7 @@
         </w:tc>
         <w:tc>
           <w:tcPr>
-            <w:tcW w:type="dxa" w:w="351"/>
+            <w:tcW w:type="dxa" w:w="722"/>
           </w:tcPr>
           <w:p>
             <w:pPr>
@@ -6912,7 +7065,7 @@
         </w:tc>
         <w:tc>
           <w:tcPr>
-            <w:tcW w:type="dxa" w:w="545"/>
+            <w:tcW w:type="dxa" w:w="1124"/>
           </w:tcPr>
           <w:p>
             <w:pPr>
@@ -6931,6 +7084,17 @@
     <w:p/>
     <w:p>
       <w:pPr>
+        <w:sectPr>
+          <w:type w:val="continuous"/>
+          <w:pgSz w:w="12240" w:h="15840"/>
+          <w:pgMar w:top="1080" w:right="1037" w:bottom="1080" w:left="1037" w:header="720" w:footer="720" w:gutter="0"/>
+          <w:cols w:space="360" w:num="1"/>
+          <w:docGrid w:linePitch="360"/>
+        </w:sectPr>
+      </w:pPr>
+    </w:p>
+    <w:p>
+      <w:pPr>
         <w:spacing w:after="40" w:before="80"/>
         <w:jc w:val="left"/>
       </w:pPr>
@@ -6940,7 +7104,7 @@
           <w:i/>
           <w:sz w:val="20"/>
         </w:rPr>
-        <w:t>Tamper detection</w:t>
+        <w:t>F. Tamper detection</w:t>
       </w:r>
     </w:p>
     <w:p>
@@ -6969,7 +7133,7 @@
           <w:i/>
           <w:sz w:val="20"/>
         </w:rPr>
-        <w:t>Propagation to an independent reader</w:t>
+        <w:t>G. Propagation to an independent reader</w:t>
       </w:r>
     </w:p>
     <w:p>
@@ -6990,15 +7154,15 @@
     <w:p>
       <w:pPr>
         <w:spacing w:after="40" w:before="120"/>
-        <w:jc w:val="left"/>
+        <w:jc w:val="center"/>
       </w:pPr>
       <w:r>
         <w:rPr>
           <w:b/>
           <w:i w:val="0"/>
-          <w:sz w:val="22"/>
-        </w:rPr>
-        <w:t>Discussion and Limitations</w:t>
+          <w:sz w:val="20"/>
+        </w:rPr>
+        <w:t>VII. DISCUSSION AND LIMITATIONS</w:t>
       </w:r>
     </w:p>
     <w:p>
@@ -7026,7 +7190,7 @@
           <w:i/>
           <w:sz w:val="20"/>
         </w:rPr>
-        <w:t>What transfers from a local chain</w:t>
+        <w:t>A. What transfers from a local chain</w:t>
       </w:r>
     </w:p>
     <w:p>
@@ -7055,7 +7219,7 @@
           <w:i/>
           <w:sz w:val="20"/>
         </w:rPr>
-        <w:t>Identity and Sybil resistance</w:t>
+        <w:t>B. Identity and Sybil resistance</w:t>
       </w:r>
     </w:p>
     <w:p>
@@ -7084,7 +7248,7 @@
           <w:i/>
           <w:sz w:val="20"/>
         </w:rPr>
-        <w:t>Commit–reveal window</w:t>
+        <w:t>C. Commit–reveal window</w:t>
       </w:r>
     </w:p>
     <w:p>
@@ -7113,7 +7277,7 @@
           <w:i/>
           <w:sz w:val="20"/>
         </w:rPr>
-        <w:t>Gas at scale</w:t>
+        <w:t>D. Gas at scale</w:t>
       </w:r>
     </w:p>
     <w:p>
@@ -7142,7 +7306,7 @@
           <w:i/>
           <w:sz w:val="20"/>
         </w:rPr>
-        <w:t>Threats to validity</w:t>
+        <w:t>E. Threats to validity</w:t>
       </w:r>
     </w:p>
     <w:p>
@@ -7242,15 +7406,15 @@
     <w:p>
       <w:pPr>
         <w:spacing w:after="40" w:before="120"/>
-        <w:jc w:val="left"/>
+        <w:jc w:val="center"/>
       </w:pPr>
       <w:r>
         <w:rPr>
           <w:b/>
           <w:i w:val="0"/>
-          <w:sz w:val="22"/>
-        </w:rPr>
-        <w:t>Conclusion</w:t>
+          <w:sz w:val="20"/>
+        </w:rPr>
+        <w:t>VIII. CONCLUSION</w:t>
       </w:r>
     </w:p>
     <w:p>
@@ -7265,7 +7429,7 @@
           <w:i w:val="0"/>
           <w:sz w:val="20"/>
         </w:rPr>
-        <w:t>A shared ledger carrying nothing but tagged hashes can replace the correlation function of a central threat-intelligence hub for a set of honeypots that do not trust one another. Measured on a live chain with up to 16 writers, the scheme serializes at about 255 events/s, costs 22,120 gas per IOC unbatched and 337 gas at B=64, exactly as the calldata model predicts, and lets a new node rebuild the global view at 3.01 ms per block. The accuracy of the corroboration signal depends on the keying function: exact hashing recovers 27.5% of varied campaigns, a /24-plus-template key recovers 81.2% at full precision, and coarser keys trade precision for recall. The plain scheme is defenseless against an echo adversary; a commit–reveal extension removes that attack at 2.0× the gas and a bounded corroboration window. Against a measured hub the ledger costs a factor of 6.8 in throughput on this testbed and more on a distributed chain. Related work covers blockchain security and cybersecurity[20, 21]. Smart-contract analysis and proof-of-work optimization are addressed in[22, 23]. These are the measured costs of removing the trusted intermediary.</w:t>
+        <w:t>A shared ledger carrying nothing but tagged hashes can replace the correlation function of a central threat-intelligence hub for a set of honeypots that do not trust one another. Measured on a live chain with up to 16 writers, the scheme serializes at about 255 events/s, costs 22,120 gas per IOC unbatched and 337 gas at B=64, exactly as the calldata model predicts, and lets a new node rebuild the global view at 3.01 ms per block. The accuracy of the corroboration signal depends on the keying function: exact hashing recovers 27.5% of varied campaigns, a /24-plus-template key recovers 81.2% at full precision, and coarser keys trade precision for recall. The plain scheme is defenseless against an echo adversary; a commit–reveal extension removes that attack at 2.0× the gas and a bounded corroboration window. Against a measured hub the ledger costs a factor of 6.8 in throughput on this testbed and more on a distributed chain. These are the measured costs of removing the trusted intermediary.</w:t>
       </w:r>
     </w:p>
     <w:p>
@@ -7280,13 +7444,12 @@
           <w:i w:val="0"/>
           <w:sz w:val="20"/>
         </w:rPr>
-        <w:t>0.806.4pt</w:t>
       </w:r>
     </w:p>
     <w:p>
       <w:pPr>
         <w:spacing w:after="40"/>
-        <w:jc w:val="left"/>
+        <w:jc w:val="center"/>
       </w:pPr>
       <w:r>
         <w:rPr>
@@ -7294,7 +7457,7 @@
           <w:i w:val="0"/>
           <w:sz w:val="20"/>
         </w:rPr>
-        <w:t>References</w:t>
+        <w:t>REFERENCES</w:t>
       </w:r>
     </w:p>
     <w:p>
@@ -7420,7 +7583,7 @@
           <w:i w:val="0"/>
           <w:sz w:val="17"/>
         </w:rPr>
-        <w:t>[9] K. Dunnett, S. Pal, and Z. Jadidi, “Challenges and opportunities of blockchain for cyber threat intelligence sharing,” 2022, arXiv:2205.03822.</w:t>
+        <w:t>[9] T. Jiang, G. Shen, C. Guo, Y. Cui, and B. Xie, “BFLS: Blockchain and federated learning for sharing threat detection models as cyber threat intelligence,” Comput. Netw., vol. 224, art. 109604, 2023, doi: 10.1016/j.comnet.2023.109604.</w:t>
       </w:r>
     </w:p>
     <w:p>
@@ -7434,7 +7597,7 @@
           <w:i w:val="0"/>
           <w:sz w:val="17"/>
         </w:rPr>
-        <w:t>[10] T. Jiang, G. Shen, C. Guo, Y. Cui, and B. Xie, “BFLS: Blockchain and federated learning for sharing threat detection models as cyber threat intelligence,” Comput. Netw., vol. 224, art. 109604, 2023, doi: 10.1016/j.comnet.2023.109604.</w:t>
+        <w:t>[10] Y. Otoum, A. Asad, and A. Nayak, “Blockchain meets adaptive honeypots: A trust-aware approach to next-gen IoT security,” 2025, arXiv:2504.16226.</w:t>
       </w:r>
     </w:p>
     <w:p>
@@ -7448,7 +7611,7 @@
           <w:i w:val="0"/>
           <w:sz w:val="17"/>
         </w:rPr>
-        <w:t>[11] A. Tariq, T. Qayyum, S. Alrabaee, and M. A. Serhani, “Blockchain and distributed ledger technologies for cyberthreat intelligence sharing,” 2025, arXiv:2504.02537.</w:t>
+        <w:t>[11] K. Dunnett, S. Pal, and Z. Jadidi, “Challenges and opportunities of blockchain for cyber threat intelligence sharing,” 2022, arXiv:2205.03822.</w:t>
       </w:r>
     </w:p>
     <w:p>
@@ -7462,7 +7625,7 @@
           <w:i w:val="0"/>
           <w:sz w:val="17"/>
         </w:rPr>
-        <w:t>[12] L. Lamport, R. Shostak, and M. Pease, “The Byzantine generals problem,” ACM Trans. Program. Lang. Syst., vol. 4, no. 3, pp. 382–401, Jul. 1982.</w:t>
+        <w:t>[12] A. Tariq, T. Qayyum, S. Alrabaee, and M. A. Serhani, “Blockchain and distributed ledger technologies for cyberthreat intelligence sharing,” 2025, arXiv:2504.02537.</w:t>
       </w:r>
     </w:p>
     <w:p>
@@ -7476,7 +7639,7 @@
           <w:i w:val="0"/>
           <w:sz w:val="17"/>
         </w:rPr>
-        <w:t>[13] N. Provos, “A virtual honeypot framework,” in Proc. 13th USENIX Secur. Symp., San Diego, CA, USA, 2004, pp. 1–14.</w:t>
+        <w:t>[13] L. Lamport, R. Shostak, and M. Pease, “The Byzantine generals problem,” ACM Trans. Program. Lang. Syst., vol. 4, no. 3, pp. 382–401, Jul. 1982.</w:t>
       </w:r>
     </w:p>
     <w:p>
@@ -7490,7 +7653,7 @@
           <w:i w:val="0"/>
           <w:sz w:val="17"/>
         </w:rPr>
-        <w:t>[14] M. Nawrocki, M. Wahlisch, T. C. Schmidt, C. Keil, and J. Schonfelder, “A survey on honeypot software and data analysis,” 2016, arXiv:1608.06249.</w:t>
+        <w:t>[14] N. Provos, “A virtual honeypot framework,” in Proc. 13th USENIX Secur. Symp., San Diego, CA, USA, 2004, pp. 1–14.</w:t>
       </w:r>
     </w:p>
     <w:p>
@@ -7504,7 +7667,7 @@
           <w:i w:val="0"/>
           <w:sz w:val="17"/>
         </w:rPr>
-        <w:t>[15] A. Vetterl and R. Clayton, “Bitter Harvest: Systematically fingerprinting low- and medium-interaction honeypots at Internet scale,” in Proc. 12th USENIX Workshop Offensive Technol. (WOOT), Baltimore, MD, USA, 2018.</w:t>
+        <w:t>[15] M. Nawrocki, M. Wahlisch, T. C. Schmidt, C. Keil, and J. Schonfelder, “A survey on honeypot software and data analysis,” 2016, arXiv:1608.06249.</w:t>
       </w:r>
     </w:p>
     <w:p>
@@ -7518,7 +7681,7 @@
           <w:i w:val="0"/>
           <w:sz w:val="17"/>
         </w:rPr>
-        <w:t>[16] Y. Otoum, A. Asad, and A. Nayak, “Blockchain meets adaptive honeypots: A trust-aware approach to next-gen IoT security,” 2025, arXiv:2504.16226.</w:t>
+        <w:t>[16] A. Vetterl and R. Clayton, “Bitter Harvest: Systematically fingerprinting low- and medium-interaction honeypots at Internet scale,” in Proc. 12th USENIX Workshop Offensive Technol. (WOOT), Baltimore, MD, USA, 2018.</w:t>
       </w:r>
     </w:p>
     <w:p>
@@ -7566,96 +7729,6 @@
     <w:p>
       <w:pPr>
         <w:spacing w:after="40"/>
-        <w:jc w:val="left"/>
-      </w:pPr>
-      <w:r>
-        <w:rPr>
-          <w:b w:val="0"/>
-          <w:i w:val="0"/>
-          <w:sz w:val="17"/>
-        </w:rPr>
-        <w:t>[20] R. Prakash et al., “Blockchain technology for cybersecurity: A text mining literature analysis,” Int. J. Inf. Manage. Data Insights, 2022, doi: 10.1016/j.jjimei.2022.100112.</w:t>
-      </w:r>
-    </w:p>
-    <w:p>
-      <w:pPr>
-        <w:spacing w:after="40"/>
-        <w:jc w:val="left"/>
-      </w:pPr>
-      <w:r>
-        <w:rPr>
-          <w:b w:val="0"/>
-          <w:i w:val="0"/>
-          <w:sz w:val="17"/>
-        </w:rPr>
-        <w:t>[21] Kavya G., P. Nambiar, P. Anil, V. Akash, and Radhika G., “Hybrid NLP-Driven Cybersecurity: Transformer-Based Threat Detection Enhanced with Explainable AI,” Lecture Notes in Networks and Systems, vol. 1770, pp. 105–116, 2026, doi: 10.1007/978-3-032-14038-8</w:t>
-      </w:r>
-      <w:r>
-        <w:rPr>
-          <w:b w:val="0"/>
-          <w:i w:val="0"/>
-          <w:sz w:val="17"/>
-          <w:vertAlign w:val="subscript"/>
-        </w:rPr>
-        <w:t>9</w:t>
-      </w:r>
-      <w:r>
-        <w:rPr>
-          <w:b w:val="0"/>
-          <w:i w:val="0"/>
-          <w:sz w:val="17"/>
-        </w:rPr>
-        <w:t>.</w:t>
-      </w:r>
-    </w:p>
-    <w:p>
-      <w:pPr>
-        <w:spacing w:after="40"/>
-        <w:jc w:val="left"/>
-      </w:pPr>
-      <w:r>
-        <w:rPr>
-          <w:b w:val="0"/>
-          <w:i w:val="0"/>
-          <w:sz w:val="17"/>
-        </w:rPr>
-        <w:t>[22] S. Anuswethaa et al., “SCARF: Smart Contract Analysis and Risk Framework for Detecting Vulnerabilities Using Advanced Deep Learning Hybrid Model,” in Lecture Notes in Networks and Systems, vol. 1766, pp. 343–354, 2026, doi: 10.1007/978-3-032-13806-4</w:t>
-      </w:r>
-      <w:r>
-        <w:rPr>
-          <w:b w:val="0"/>
-          <w:i w:val="0"/>
-          <w:sz w:val="17"/>
-          <w:vertAlign w:val="subscript"/>
-        </w:rPr>
-        <w:t>28</w:t>
-      </w:r>
-      <w:r>
-        <w:rPr>
-          <w:b w:val="0"/>
-          <w:i w:val="0"/>
-          <w:sz w:val="17"/>
-        </w:rPr>
-        <w:t>.</w:t>
-      </w:r>
-    </w:p>
-    <w:p>
-      <w:pPr>
-        <w:spacing w:after="40"/>
-        <w:jc w:val="left"/>
-      </w:pPr>
-      <w:r>
-        <w:rPr>
-          <w:b w:val="0"/>
-          <w:i w:val="0"/>
-          <w:sz w:val="17"/>
-        </w:rPr>
-        <w:t>[23] P. V. Arunasree, U. Jothi, and S. Sumathi, “GA-PoW: A novel genetic algorithm-based proof of work approach for optimal nonce selection in blockchain network,” International Journal of Information Technology, 2025, doi: 10.1007/s41870-025-02920-3.</w:t>
-      </w:r>
-    </w:p>
-    <w:p>
-      <w:pPr>
-        <w:spacing w:after="40"/>
         <w:ind w:firstLine="202"/>
         <w:jc w:val="both"/>
       </w:pPr>
@@ -7668,9 +7741,10 @@
       </w:r>
     </w:p>
     <w:sectPr>
+      <w:type w:val="continuous"/>
       <w:pgSz w:w="12240" w:h="15840"/>
       <w:pgMar w:top="1080" w:right="1037" w:bottom="1080" w:left="1037" w:header="720" w:footer="720" w:gutter="0"/>
-      <w:cols w:space="720"/>
+      <w:cols w:space="360" w:num="2"/>
       <w:docGrid w:linePitch="360"/>
     </w:sectPr>
   </w:body>

</xml_diff>